<commit_message>
Complete Day 7 authentication and development bootstrap
</commit_message>
<xml_diff>
--- a/doc/AI-KCP-Git-GitHub-Operations-Guide-v1.0-20260921-0940.docx
+++ b/doc/AI-KCP-Git-GitHub-Operations-Guide-v1.0-20260921-0940.docx
@@ -2121,6 +2121,477 @@
         </w:rPr>
       </w:pPr>
     </w:p>
+    <w:p>
+      <w:pPr>
+        <w:rPr>
+          <w:b/>
+        </w:rPr>
+      </w:pPr>
+      <w:r>
+        <w:rPr>
+          <w:b/>
+        </w:rPr>
+        <w:t>After restarting the system::</w:t>
+      </w:r>
+    </w:p>
+    <w:p>
+      <w:pPr>
+        <w:pStyle w:val="ListParagraph"/>
+        <w:numPr>
+          <w:ilvl w:val="0"/>
+          <w:numId w:val="10"/>
+        </w:numPr>
+        <w:rPr>
+          <w:bCs/>
+        </w:rPr>
+      </w:pPr>
+      <w:r>
+        <w:rPr>
+          <w:bCs/>
+        </w:rPr>
+        <w:t>CD C:\Ashish\AIKCP</w:t>
+      </w:r>
+    </w:p>
+    <w:p>
+      <w:pPr>
+        <w:pStyle w:val="ListParagraph"/>
+        <w:numPr>
+          <w:ilvl w:val="0"/>
+          <w:numId w:val="10"/>
+        </w:numPr>
+        <w:rPr>
+          <w:b/>
+          <w:bCs/>
+          <w:lang w:val="en-IN"/>
+        </w:rPr>
+      </w:pPr>
+      <w:r>
+        <w:rPr>
+          <w:b/>
+          <w:bCs/>
+          <w:lang w:val="en-IN"/>
+        </w:rPr>
+        <w:t>Start Supabase local services</w:t>
+      </w:r>
+    </w:p>
+    <w:p>
+      <w:pPr>
+        <w:ind w:left="720" w:firstLine="720"/>
+        <w:rPr>
+          <w:bCs/>
+          <w:lang w:val="en-IN"/>
+        </w:rPr>
+      </w:pPr>
+      <w:r>
+        <w:rPr>
+          <w:bCs/>
+          <w:lang w:val="en-IN"/>
+        </w:rPr>
+        <w:t>npx supabase start</w:t>
+      </w:r>
+    </w:p>
+    <w:p>
+      <w:pPr>
+        <w:pStyle w:val="ListParagraph"/>
+        <w:numPr>
+          <w:ilvl w:val="0"/>
+          <w:numId w:val="10"/>
+        </w:numPr>
+        <w:rPr>
+          <w:bCs/>
+          <w:lang w:val="en-IN"/>
+        </w:rPr>
+      </w:pPr>
+      <w:r>
+        <w:rPr>
+          <w:b/>
+          <w:bCs/>
+          <w:lang w:val="en-IN"/>
+        </w:rPr>
+        <w:t xml:space="preserve">Start the frontend, </w:t>
+      </w:r>
+      <w:r>
+        <w:rPr>
+          <w:bCs/>
+          <w:lang w:val="en-IN"/>
+        </w:rPr>
+        <w:t xml:space="preserve">Open a </w:t>
+      </w:r>
+      <w:r>
+        <w:rPr>
+          <w:b/>
+          <w:bCs/>
+          <w:lang w:val="en-IN"/>
+        </w:rPr>
+        <w:t>second PowerShell window</w:t>
+      </w:r>
+      <w:r>
+        <w:rPr>
+          <w:bCs/>
+          <w:lang w:val="en-IN"/>
+        </w:rPr>
+        <w:t>:</w:t>
+      </w:r>
+    </w:p>
+    <w:p>
+      <w:pPr>
+        <w:ind w:left="720" w:firstLine="720"/>
+        <w:rPr>
+          <w:bCs/>
+          <w:lang w:val="en-IN"/>
+        </w:rPr>
+      </w:pPr>
+      <w:r>
+        <w:rPr>
+          <w:bCs/>
+          <w:lang w:val="en-IN"/>
+        </w:rPr>
+        <w:t>npm run dev</w:t>
+      </w:r>
+    </w:p>
+    <w:p>
+      <w:pPr>
+        <w:pStyle w:val="ListParagraph"/>
+        <w:numPr>
+          <w:ilvl w:val="0"/>
+          <w:numId w:val="10"/>
+        </w:numPr>
+        <w:rPr>
+          <w:bCs/>
+        </w:rPr>
+      </w:pPr>
+      <w:r>
+        <w:rPr>
+          <w:bCs/>
+        </w:rPr>
+        <w:lastRenderedPageBreak/>
+        <w:t>Recreate only the authentication variables</w:t>
+      </w:r>
+    </w:p>
+    <w:p>
+      <w:pPr>
+        <w:ind w:left="720"/>
+        <w:rPr>
+          <w:bCs/>
+        </w:rPr>
+      </w:pPr>
+      <w:r>
+        <w:rPr>
+          <w:bCs/>
+        </w:rPr>
+        <w:t>Get-Content .\.env.local | ForEach-Object {</w:t>
+      </w:r>
+    </w:p>
+    <w:p>
+      <w:pPr>
+        <w:ind w:left="720"/>
+        <w:rPr>
+          <w:bCs/>
+        </w:rPr>
+      </w:pPr>
+      <w:r>
+        <w:rPr>
+          <w:bCs/>
+        </w:rPr>
+        <w:t xml:space="preserve">    if ($_ -match '^\s*([^=]+)=') {</w:t>
+      </w:r>
+    </w:p>
+    <w:p>
+      <w:pPr>
+        <w:ind w:left="720"/>
+        <w:rPr>
+          <w:bCs/>
+        </w:rPr>
+      </w:pPr>
+      <w:r>
+        <w:rPr>
+          <w:bCs/>
+        </w:rPr>
+        <w:t xml:space="preserve">        "$($matches[1])=[REDACTED]"</w:t>
+      </w:r>
+    </w:p>
+    <w:p>
+      <w:pPr>
+        <w:ind w:left="720"/>
+        <w:rPr>
+          <w:bCs/>
+        </w:rPr>
+      </w:pPr>
+      <w:r>
+        <w:rPr>
+          <w:bCs/>
+        </w:rPr>
+        <w:t xml:space="preserve">    }</w:t>
+      </w:r>
+    </w:p>
+    <w:p>
+      <w:pPr>
+        <w:ind w:left="720"/>
+        <w:rPr>
+          <w:bCs/>
+        </w:rPr>
+      </w:pPr>
+      <w:r>
+        <w:rPr>
+          <w:bCs/>
+        </w:rPr>
+        <w:t>}</w:t>
+      </w:r>
+    </w:p>
+    <w:p>
+      <w:pPr>
+        <w:pStyle w:val="ListParagraph"/>
+        <w:numPr>
+          <w:ilvl w:val="0"/>
+          <w:numId w:val="10"/>
+        </w:numPr>
+        <w:rPr>
+          <w:bCs/>
+        </w:rPr>
+      </w:pPr>
+      <w:r>
+        <w:rPr>
+          <w:bCs/>
+        </w:rPr>
+        <w:t>Git status</w:t>
+      </w:r>
+    </w:p>
+    <w:p>
+      <w:pPr>
+        <w:pStyle w:val="ListParagraph"/>
+        <w:numPr>
+          <w:ilvl w:val="0"/>
+          <w:numId w:val="10"/>
+        </w:numPr>
+        <w:rPr>
+          <w:bCs/>
+        </w:rPr>
+      </w:pPr>
+      <w:r>
+        <w:rPr>
+          <w:bCs/>
+        </w:rPr>
+        <w:t>Npx supabase start</w:t>
+      </w:r>
+    </w:p>
+    <w:p>
+      <w:pPr>
+        <w:pStyle w:val="ListParagraph"/>
+        <w:numPr>
+          <w:ilvl w:val="0"/>
+          <w:numId w:val="10"/>
+        </w:numPr>
+        <w:rPr>
+          <w:bCs/>
+        </w:rPr>
+      </w:pPr>
+      <w:r>
+        <w:rPr>
+          <w:bCs/>
+        </w:rPr>
+        <w:t>Npx supabase status</w:t>
+      </w:r>
+    </w:p>
+    <w:p>
+      <w:pPr>
+        <w:pStyle w:val="ListParagraph"/>
+        <w:numPr>
+          <w:ilvl w:val="0"/>
+          <w:numId w:val="10"/>
+        </w:numPr>
+        <w:rPr>
+          <w:bCs/>
+        </w:rPr>
+      </w:pPr>
+      <w:r>
+        <w:rPr>
+          <w:bCs/>
+        </w:rPr>
+        <w:t>Npx supabase db reset</w:t>
+      </w:r>
+      <w:r>
+        <w:rPr>
+          <w:bCs/>
+        </w:rPr>
+        <w:t xml:space="preserve"> (WARNING : Only if needed)</w:t>
+      </w:r>
+    </w:p>
+    <w:p>
+      <w:pPr>
+        <w:pStyle w:val="ListParagraph"/>
+        <w:numPr>
+          <w:ilvl w:val="0"/>
+          <w:numId w:val="10"/>
+        </w:numPr>
+        <w:rPr>
+          <w:bCs/>
+        </w:rPr>
+      </w:pPr>
+      <w:r>
+        <w:rPr>
+          <w:bCs/>
+        </w:rPr>
+        <w:t>docker ps --format "table {{.Names}}\t{{.Status}}\t{{.Ports}}"</w:t>
+      </w:r>
+    </w:p>
+    <w:p>
+      <w:pPr>
+        <w:pStyle w:val="ListParagraph"/>
+        <w:numPr>
+          <w:ilvl w:val="0"/>
+          <w:numId w:val="10"/>
+        </w:numPr>
+        <w:rPr>
+          <w:bCs/>
+        </w:rPr>
+      </w:pPr>
+      <w:r>
+        <w:rPr>
+          <w:bCs/>
+        </w:rPr>
+        <w:t>Test-NetConnection 127.0.0.1 -Port 54321</w:t>
+      </w:r>
+    </w:p>
+    <w:p>
+      <w:pPr>
+        <w:pStyle w:val="ListParagraph"/>
+        <w:numPr>
+          <w:ilvl w:val="0"/>
+          <w:numId w:val="10"/>
+        </w:numPr>
+        <w:rPr>
+          <w:bCs/>
+        </w:rPr>
+      </w:pPr>
+      <w:r>
+        <w:rPr>
+          <w:bCs/>
+        </w:rPr>
+        <w:t>Npx run dev</w:t>
+      </w:r>
+    </w:p>
+    <w:p>
+      <w:pPr>
+        <w:pStyle w:val="ListParagraph"/>
+        <w:numPr>
+          <w:ilvl w:val="0"/>
+          <w:numId w:val="10"/>
+        </w:numPr>
+        <w:rPr>
+          <w:bCs/>
+        </w:rPr>
+      </w:pPr>
+    </w:p>
+    <w:p>
+      <w:pPr>
+        <w:ind w:left="720"/>
+        <w:rPr>
+          <w:bCs/>
+        </w:rPr>
+      </w:pPr>
+      <w:r>
+        <w:rPr>
+          <w:bCs/>
+        </w:rPr>
+        <w:t>docker restart supabase_kong_AIKCP</w:t>
+      </w:r>
+    </w:p>
+    <w:p>
+      <w:pPr>
+        <w:ind w:left="720"/>
+        <w:rPr>
+          <w:bCs/>
+        </w:rPr>
+      </w:pPr>
+      <w:r>
+        <w:rPr>
+          <w:bCs/>
+        </w:rPr>
+        <w:t>docker port supabase_kong_AIKCP</w:t>
+      </w:r>
+    </w:p>
+    <w:p>
+      <w:pPr>
+        <w:ind w:left="720"/>
+        <w:rPr>
+          <w:bCs/>
+        </w:rPr>
+      </w:pPr>
+      <w:r>
+        <w:rPr>
+          <w:bCs/>
+        </w:rPr>
+        <w:t>docker inspect supabase_kong_AIKCP --format '{{json .NetworkSettings.Ports}}'</w:t>
+      </w:r>
+    </w:p>
+    <w:p>
+      <w:pPr>
+        <w:ind w:left="720"/>
+        <w:rPr>
+          <w:bCs/>
+        </w:rPr>
+      </w:pPr>
+      <w:r>
+        <w:rPr>
+          <w:bCs/>
+        </w:rPr>
+        <w:t>Test-NetConnection 127.0.0.1 -Port 54321</w:t>
+      </w:r>
+    </w:p>
+    <w:p>
+      <w:pPr>
+        <w:ind w:left="720"/>
+        <w:rPr>
+          <w:bCs/>
+        </w:rPr>
+      </w:pPr>
+      <w:r>
+        <w:rPr>
+          <w:bCs/>
+        </w:rPr>
+        <w:t>curl.exe -v http://127.0.0.1:54321/</w:t>
+      </w:r>
+    </w:p>
+    <w:p>
+      <w:pPr>
+        <w:ind w:left="720"/>
+        <w:rPr>
+          <w:bCs/>
+        </w:rPr>
+      </w:pPr>
+    </w:p>
+    <w:p>
+      <w:pPr>
+        <w:ind w:left="720"/>
+        <w:rPr>
+          <w:bCs/>
+        </w:rPr>
+      </w:pPr>
+    </w:p>
+    <w:p>
+      <w:pPr>
+        <w:ind w:left="720"/>
+        <w:rPr>
+          <w:bCs/>
+        </w:rPr>
+      </w:pPr>
+    </w:p>
+    <w:p>
+      <w:pPr>
+        <w:ind w:left="720"/>
+        <w:rPr>
+          <w:bCs/>
+        </w:rPr>
+      </w:pPr>
+    </w:p>
+    <w:p>
+      <w:pPr>
+        <w:ind w:left="720"/>
+        <w:rPr>
+          <w:bCs/>
+        </w:rPr>
+      </w:pPr>
+    </w:p>
     <w:p/>
     <w:sectPr>
       <w:pgSz w:w="12240" w:h="15840"/>
@@ -2303,6 +2774,95 @@
       <w:rPr>
         <w:rFonts w:ascii="Symbol" w:hAnsi="Symbol" w:hint="default"/>
       </w:rPr>
+    </w:lvl>
+  </w:abstractNum>
+  <w:abstractNum w:abstractNumId="9" w15:restartNumberingAfterBreak="0">
+    <w:nsid w:val="7DC95AE2"/>
+    <w:multiLevelType w:val="hybridMultilevel"/>
+    <w:tmpl w:val="B95EF3DA"/>
+    <w:lvl w:ilvl="0" w:tplc="84426B8E">
+      <w:start w:val="1"/>
+      <w:numFmt w:val="decimal"/>
+      <w:lvlText w:val="%1."/>
+      <w:lvlJc w:val="left"/>
+      <w:pPr>
+        <w:ind w:left="1080" w:hanging="360"/>
+      </w:pPr>
+      <w:rPr>
+        <w:rFonts w:hint="default"/>
+      </w:rPr>
+    </w:lvl>
+    <w:lvl w:ilvl="1" w:tplc="40090019" w:tentative="1">
+      <w:start w:val="1"/>
+      <w:numFmt w:val="lowerLetter"/>
+      <w:lvlText w:val="%2."/>
+      <w:lvlJc w:val="left"/>
+      <w:pPr>
+        <w:ind w:left="1800" w:hanging="360"/>
+      </w:pPr>
+    </w:lvl>
+    <w:lvl w:ilvl="2" w:tplc="4009001B" w:tentative="1">
+      <w:start w:val="1"/>
+      <w:numFmt w:val="lowerRoman"/>
+      <w:lvlText w:val="%3."/>
+      <w:lvlJc w:val="right"/>
+      <w:pPr>
+        <w:ind w:left="2520" w:hanging="180"/>
+      </w:pPr>
+    </w:lvl>
+    <w:lvl w:ilvl="3" w:tplc="4009000F" w:tentative="1">
+      <w:start w:val="1"/>
+      <w:numFmt w:val="decimal"/>
+      <w:lvlText w:val="%4."/>
+      <w:lvlJc w:val="left"/>
+      <w:pPr>
+        <w:ind w:left="3240" w:hanging="360"/>
+      </w:pPr>
+    </w:lvl>
+    <w:lvl w:ilvl="4" w:tplc="40090019" w:tentative="1">
+      <w:start w:val="1"/>
+      <w:numFmt w:val="lowerLetter"/>
+      <w:lvlText w:val="%5."/>
+      <w:lvlJc w:val="left"/>
+      <w:pPr>
+        <w:ind w:left="3960" w:hanging="360"/>
+      </w:pPr>
+    </w:lvl>
+    <w:lvl w:ilvl="5" w:tplc="4009001B" w:tentative="1">
+      <w:start w:val="1"/>
+      <w:numFmt w:val="lowerRoman"/>
+      <w:lvlText w:val="%6."/>
+      <w:lvlJc w:val="right"/>
+      <w:pPr>
+        <w:ind w:left="4680" w:hanging="180"/>
+      </w:pPr>
+    </w:lvl>
+    <w:lvl w:ilvl="6" w:tplc="4009000F" w:tentative="1">
+      <w:start w:val="1"/>
+      <w:numFmt w:val="decimal"/>
+      <w:lvlText w:val="%7."/>
+      <w:lvlJc w:val="left"/>
+      <w:pPr>
+        <w:ind w:left="5400" w:hanging="360"/>
+      </w:pPr>
+    </w:lvl>
+    <w:lvl w:ilvl="7" w:tplc="40090019" w:tentative="1">
+      <w:start w:val="1"/>
+      <w:numFmt w:val="lowerLetter"/>
+      <w:lvlText w:val="%8."/>
+      <w:lvlJc w:val="left"/>
+      <w:pPr>
+        <w:ind w:left="6120" w:hanging="360"/>
+      </w:pPr>
+    </w:lvl>
+    <w:lvl w:ilvl="8" w:tplc="4009001B" w:tentative="1">
+      <w:start w:val="1"/>
+      <w:numFmt w:val="lowerRoman"/>
+      <w:lvlText w:val="%9."/>
+      <w:lvlJc w:val="right"/>
+      <w:pPr>
+        <w:ind w:left="6840" w:hanging="180"/>
+      </w:pPr>
     </w:lvl>
   </w:abstractNum>
   <w:num w:numId="1" w16cid:durableId="38432522">
@@ -2331,6 +2891,9 @@
   </w:num>
   <w:num w:numId="9" w16cid:durableId="2048329669">
     <w:abstractNumId w:val="0"/>
+  </w:num>
+  <w:num w:numId="10" w16cid:durableId="1406107020">
+    <w:abstractNumId w:val="9"/>
   </w:num>
 </w:numbering>
 </file>
@@ -2724,7 +3287,7 @@
   <w:style w:type="paragraph" w:default="1" w:styleId="Normal">
     <w:name w:val="Normal"/>
     <w:qFormat/>
-    <w:rsid w:val="00FC693F"/>
+    <w:rsid w:val="004A61BF"/>
     <w:rPr>
       <w:rFonts w:ascii="Aptos" w:hAnsi="Aptos"/>
       <w:sz w:val="21"/>
@@ -2942,6 +3505,7 @@
   <w:style w:type="character" w:default="1" w:styleId="DefaultParagraphFont">
     <w:name w:val="Default Paragraph Font"/>
     <w:uiPriority w:val="1"/>
+    <w:semiHidden/>
     <w:unhideWhenUsed/>
   </w:style>
   <w:style w:type="table" w:default="1" w:styleId="TableNormal">

</xml_diff>